<commit_message>
Made sure ID's are correct
</commit_message>
<xml_diff>
--- a/docs/PED v3.0/Deployment_Compatibility.docx
+++ b/docs/PED v3.0/Deployment_Compatibility.docx
@@ -198,7 +198,19 @@
       <w:proofErr w:type="spellEnd"/>
       <w:proofErr w:type="gramEnd"/>
       <w:r>
-        <w:t>) configured with explicit connection timeouts and SSL support, compatible with managed cloud databases and the primary-replica failover architecture defined in Section 8.5.1 (REQ-034, REQ-036).</w:t>
+        <w:t>) configured with explicit connection timeouts and SSL support, compatible with managed cloud databases and the primary-replica failover architecture defined in Section 8.5.1 (REQ-0</w:t>
+      </w:r>
+      <w:r>
+        <w:t>26</w:t>
+      </w:r>
+      <w:r>
+        <w:t>, REQ-0</w:t>
+      </w:r>
+      <w:r>
+        <w:t>28</w:t>
+      </w:r>
+      <w:r>
+        <w:t>).</w:t>
       </w:r>
     </w:p>
     <w:p>
@@ -388,7 +400,13 @@
         <w:t>):</w:t>
       </w:r>
       <w:r>
-        <w:t xml:space="preserve"> As noted in Section 15 (Forward Engineering Considerations), relying on free-tier cloud PaaS/DB providers introduces risks of vendor plan removal (Heroku, n.d.), connection limits under 210 concurrent users (R04), or container sleep/cold-start delays exceeding the 10-second processing boundary (REQ-025, R03).</w:t>
+        <w:t xml:space="preserve"> As noted in Section 15 (Forward Engineering Considerations), relying on free-tier cloud PaaS/DB providers introduces risks of vendor plan removal (Heroku, n.d.), connection limits under 210 concurrent users (R04), or container sleep/cold-start delays exceeding the 10-second processing boundary (REQ-0</w:t>
+      </w:r>
+      <w:r>
+        <w:t>19</w:t>
+      </w:r>
+      <w:r>
+        <w:t>, R03).</w:t>
       </w:r>
     </w:p>
     <w:p>
@@ -485,7 +503,13 @@
         </w:numPr>
       </w:pPr>
       <w:r>
-        <w:t>Automated live standby database failover execution and automated backup restoration testing (REQ-036, R05, Section 8.5.4).</w:t>
+        <w:t>Automated live standby database failover execution and automated backup restoration testing (REQ-0</w:t>
+      </w:r>
+      <w:r>
+        <w:t>28</w:t>
+      </w:r>
+      <w:r>
+        <w:t>, R05, Section 8.5.4).</w:t>
       </w:r>
     </w:p>
     <w:p>
@@ -1909,6 +1933,7 @@
   <w:style w:type="character" w:default="1" w:styleId="DefaultParagraphFont">
     <w:name w:val="Default Paragraph Font"/>
     <w:uiPriority w:val="1"/>
+    <w:semiHidden/>
     <w:unhideWhenUsed/>
   </w:style>
   <w:style w:type="table" w:default="1" w:styleId="TableNormal">

</xml_diff>